<commit_message>
pentest: docs de auditoria
</commit_message>
<xml_diff>
--- a/docs/auditoria-seguridad-siprecom.docx
+++ b/docs/auditoria-seguridad-siprecom.docx
@@ -2,33 +2,7 @@
 <file path=word/document.xml><?xml version="1.0" encoding="utf-8"?>
 <w:document xmlns:w="http://schemas.openxmlformats.org/wordprocessingml/2006/main" xmlns:m="http://schemas.openxmlformats.org/officeDocument/2006/math" xmlns:r="http://schemas.openxmlformats.org/officeDocument/2006/relationships" xmlns:o="urn:schemas-microsoft-com:office:office" xmlns:v="urn:schemas-microsoft-com:vml" xmlns:w10="urn:schemas-microsoft-com:office:word" xmlns:a="http://schemas.openxmlformats.org/drawingml/2006/main" xmlns:pic="http://schemas.openxmlformats.org/drawingml/2006/picture" xmlns:wp="http://schemas.openxmlformats.org/drawingml/2006/wordprocessingDrawing">
   <w:body>
-    <w:sdt>
-      <w:sdtPr>
-        <w:docPartObj>
-          <w:docPartGallery w:val="Table of Contents"/>
-          <w:docPartUnique/>
-        </w:docPartObj>
-      </w:sdtPr>
-      <w:sdtContent>
-        <w:p>
-          <w:pPr>
-            <w:pStyle w:val="TOCHeading"/>
-          </w:pPr>
-          <w:r>
-            <w:t xml:space="preserve">Table of Contents</w:t>
-          </w:r>
-        </w:p>
-        <w:p>
-          <w:r>
-            <w:fldChar w:fldCharType="begin" w:dirty="true"/>
-            <w:instrText xml:space="preserve">TOC \o "1-2" \h \z \u</w:instrText>
-            <w:fldChar w:fldCharType="separate"/>
-            <w:fldChar w:fldCharType="end"/>
-          </w:r>
-        </w:p>
-      </w:sdtContent>
-    </w:sdt>
-    <w:bookmarkStart w:id="31" w:name="auditoría-de-seguridad--siprecom-api"/>
+    <w:bookmarkStart w:id="34" w:name="auditoría-de-seguridad-siprecom-api"/>
     <w:p>
       <w:pPr>
         <w:pStyle w:val="Heading1"/>
@@ -85,7 +59,7 @@
         </w:pict>
       </w:r>
     </w:p>
-    <w:bookmarkStart w:id="9" w:name="X5dd895b2072e59d4361bd2729ab69ff88775738"/>
+    <w:bookmarkStart w:id="9" w:name="resumen-ejecutivo"/>
     <w:p>
       <w:pPr>
         <w:pStyle w:val="Heading2"/>
@@ -99,7 +73,7 @@
         <w:pStyle w:val="FirstParagraph"/>
       </w:pPr>
       <w:r>
-        <w:t xml:space="preserve">Se realizó una auditoría de seguridad interna sobre la API de Siprecom antes de su pase a producción definitivo. El objetivo fue identificar oportunidades de mejora en el postura de seguridad, aplicar hardening alineado con las mejores prácticas actuales (OWASP API Security Top 10 — 2023) y dejar el sistema en óptimas condiciones para una evaluación externa formal.</w:t>
+        <w:t xml:space="preserve">Se realizó una auditoría de seguridad interna sobre la API de Siprecom antes de su pase a producción definitivo. El objetivo fue identificar oportunidades de mejora en la postura de seguridad, aplicar hardening alineado con las mejores prácticas actuales (OWASP API Security Top 10 — 2023) y dejar el sistema en óptimas condiciones para una evaluación externa formal.</w:t>
       </w:r>
     </w:p>
     <w:p>
@@ -114,7 +88,56 @@
         <w:t xml:space="preserve">Estado general del sistema</w:t>
       </w:r>
       <w:r>
-        <w:t xml:space="preserve">: ✅ Saludable. La arquitectura de autenticación, la implementación de las máquinas de estado del flujo de negocio y el manejo de transacciones siguen patrones correctos. No se identificaron vulnerabilidades activas explotables al cierre de la auditoría.</w:t>
+        <w:t xml:space="preserve">: ✅ Saludable. La arquitectura de autenticación, la implementación de las máquinas de estado del flujo de negocio, el aislamiento entre proyectos y el manejo de transacciones siguen patrones correctos.</w:t>
+      </w:r>
+      <w:r>
+        <w:t xml:space="preserve"> </w:t>
+      </w:r>
+      <w:r>
+        <w:rPr>
+          <w:b/>
+          <w:bCs/>
+        </w:rPr>
+        <w:t xml:space="preserve">No se identificaron vulnerabilidades activas explotables al cierre de la auditoría.</w:t>
+      </w:r>
+    </w:p>
+    <w:p>
+      <w:pPr>
+        <w:pStyle w:val="BodyText"/>
+      </w:pPr>
+      <w:r>
+        <w:rPr>
+          <w:b/>
+          <w:bCs/>
+        </w:rPr>
+        <w:t xml:space="preserve">Alcance de las pruebas realizadas</w:t>
+      </w:r>
+      <w:r>
+        <w:t xml:space="preserve">:</w:t>
+      </w:r>
+      <w:r>
+        <w:t xml:space="preserve"> </w:t>
+      </w:r>
+      <w:r>
+        <w:t xml:space="preserve">- Análisis estático automatizado del código</w:t>
+      </w:r>
+      <w:r>
+        <w:t xml:space="preserve"> </w:t>
+      </w:r>
+      <w:r>
+        <w:t xml:space="preserve">- Fuzzing automatizado contra la especificación OpenAPI (257 endpoints, 218 casos de prueba)</w:t>
+      </w:r>
+      <w:r>
+        <w:t xml:space="preserve"> </w:t>
+      </w:r>
+      <w:r>
+        <w:t xml:space="preserve">- Pruebas dinámicas dirigidas sobre vectores específicos (autorización cruzada entre proyectos, asignación masiva de propiedades, inyección en headers, condiciones de carrera)</w:t>
+      </w:r>
+      <w:r>
+        <w:t xml:space="preserve"> </w:t>
+      </w:r>
+      <w:r>
+        <w:t xml:space="preserve">- Escaneo pasivo automatizado (OWASP ZAP) sobre toda la superficie HTTP</w:t>
       </w:r>
     </w:p>
     <w:p>
@@ -129,9 +152,250 @@
         <w:t xml:space="preserve">Mejoras aplicadas</w:t>
       </w:r>
       <w:r>
-        <w:t xml:space="preserve">: 14 endurecimientos de seguridad orientados a defensa en profundidad.</w:t>
-      </w:r>
-    </w:p>
+        <w:t xml:space="preserve">: 17 endurecimientos de seguridad orientados a defensa en profundidad.</w:t>
+      </w:r>
+    </w:p>
+    <w:p>
+      <w:pPr>
+        <w:pStyle w:val="BodyText"/>
+      </w:pPr>
+      <w:r>
+        <w:rPr>
+          <w:b/>
+          <w:bCs/>
+        </w:rPr>
+        <w:t xml:space="preserve">Estado de validación final (OWASP ZAP baseline scan)</w:t>
+      </w:r>
+      <w:r>
+        <w:t xml:space="preserve">:</w:t>
+      </w:r>
+    </w:p>
+    <w:tbl>
+      <w:tblPr>
+        <w:tblStyle w:val="Table"/>
+        <w:tblW w:type="pct" w:w="5000"/>
+        <w:tblLayout w:type="fixed"/>
+        <w:tblLook w:firstRow="1" w:lastRow="0" w:firstColumn="0" w:lastColumn="0" w:noHBand="0" w:noVBand="0" w:val="0020"/>
+      </w:tblPr>
+      <w:tblGrid>
+        <w:gridCol w:w="2562"/>
+        <w:gridCol w:w="2562"/>
+        <w:gridCol w:w="2795"/>
+      </w:tblGrid>
+      <w:tr>
+        <w:trPr>
+          <w:tblHeader w:val="on"/>
+        </w:trPr>
+        <w:tc>
+          <w:tcPr/>
+          <w:p>
+            <w:pPr>
+              <w:pStyle w:val="Compact"/>
+            </w:pPr>
+            <w:r>
+              <w:t xml:space="preserve">Severidad</w:t>
+            </w:r>
+          </w:p>
+        </w:tc>
+        <w:tc>
+          <w:tcPr/>
+          <w:p>
+            <w:pPr>
+              <w:pStyle w:val="Compact"/>
+            </w:pPr>
+            <w:r>
+              <w:t xml:space="preserve">Hallazgos</w:t>
+            </w:r>
+          </w:p>
+        </w:tc>
+        <w:tc>
+          <w:tcPr/>
+          <w:p>
+            <w:pPr>
+              <w:pStyle w:val="Compact"/>
+            </w:pPr>
+            <w:r>
+              <w:t xml:space="preserve">Comentario</w:t>
+            </w:r>
+          </w:p>
+        </w:tc>
+      </w:tr>
+      <w:tr>
+        <w:tc>
+          <w:tcPr/>
+          <w:p>
+            <w:pPr>
+              <w:pStyle w:val="Compact"/>
+            </w:pPr>
+            <w:r>
+              <w:t xml:space="preserve">Crítica</w:t>
+            </w:r>
+          </w:p>
+        </w:tc>
+        <w:tc>
+          <w:tcPr/>
+          <w:p>
+            <w:pPr>
+              <w:pStyle w:val="Compact"/>
+            </w:pPr>
+            <w:r>
+              <w:t xml:space="preserve">0</w:t>
+            </w:r>
+          </w:p>
+        </w:tc>
+        <w:tc>
+          <w:tcPr/>
+          <w:p>
+            <w:pPr>
+              <w:pStyle w:val="Compact"/>
+            </w:pPr>
+            <w:r>
+              <w:t xml:space="preserve">—</w:t>
+            </w:r>
+          </w:p>
+        </w:tc>
+      </w:tr>
+      <w:tr>
+        <w:tc>
+          <w:tcPr/>
+          <w:p>
+            <w:pPr>
+              <w:pStyle w:val="Compact"/>
+            </w:pPr>
+            <w:r>
+              <w:t xml:space="preserve">Alta</w:t>
+            </w:r>
+          </w:p>
+        </w:tc>
+        <w:tc>
+          <w:tcPr/>
+          <w:p>
+            <w:pPr>
+              <w:pStyle w:val="Compact"/>
+            </w:pPr>
+            <w:r>
+              <w:t xml:space="preserve">0</w:t>
+            </w:r>
+          </w:p>
+        </w:tc>
+        <w:tc>
+          <w:tcPr/>
+          <w:p>
+            <w:pPr>
+              <w:pStyle w:val="Compact"/>
+            </w:pPr>
+            <w:r>
+              <w:t xml:space="preserve">—</w:t>
+            </w:r>
+          </w:p>
+        </w:tc>
+      </w:tr>
+      <w:tr>
+        <w:tc>
+          <w:tcPr/>
+          <w:p>
+            <w:pPr>
+              <w:pStyle w:val="Compact"/>
+            </w:pPr>
+            <w:r>
+              <w:t xml:space="preserve">Media</w:t>
+            </w:r>
+          </w:p>
+        </w:tc>
+        <w:tc>
+          <w:tcPr/>
+          <w:p>
+            <w:pPr>
+              <w:pStyle w:val="Compact"/>
+            </w:pPr>
+            <w:r>
+              <w:t xml:space="preserve">0</w:t>
+            </w:r>
+          </w:p>
+        </w:tc>
+        <w:tc>
+          <w:tcPr/>
+          <w:p>
+            <w:pPr>
+              <w:pStyle w:val="Compact"/>
+            </w:pPr>
+            <w:r>
+              <w:t xml:space="preserve">—</w:t>
+            </w:r>
+          </w:p>
+        </w:tc>
+      </w:tr>
+      <w:tr>
+        <w:tc>
+          <w:tcPr/>
+          <w:p>
+            <w:pPr>
+              <w:pStyle w:val="Compact"/>
+            </w:pPr>
+            <w:r>
+              <w:t xml:space="preserve">Baja</w:t>
+            </w:r>
+          </w:p>
+        </w:tc>
+        <w:tc>
+          <w:tcPr/>
+          <w:p>
+            <w:pPr>
+              <w:pStyle w:val="Compact"/>
+            </w:pPr>
+            <w:r>
+              <w:t xml:space="preserve">262</w:t>
+            </w:r>
+          </w:p>
+        </w:tc>
+        <w:tc>
+          <w:tcPr/>
+          <w:p>
+            <w:pPr>
+              <w:pStyle w:val="Compact"/>
+            </w:pPr>
+            <w:r>
+              <w:t xml:space="preserve">Falsos positivos del entorno de desarrollo (HSTS y Swagger UI no expuestos en producción)</w:t>
+            </w:r>
+          </w:p>
+        </w:tc>
+      </w:tr>
+      <w:tr>
+        <w:tc>
+          <w:tcPr/>
+          <w:p>
+            <w:pPr>
+              <w:pStyle w:val="Compact"/>
+            </w:pPr>
+            <w:r>
+              <w:t xml:space="preserve">Informativa</w:t>
+            </w:r>
+          </w:p>
+        </w:tc>
+        <w:tc>
+          <w:tcPr/>
+          <w:p>
+            <w:pPr>
+              <w:pStyle w:val="Compact"/>
+            </w:pPr>
+            <w:r>
+              <w:t xml:space="preserve">2</w:t>
+            </w:r>
+          </w:p>
+        </w:tc>
+        <w:tc>
+          <w:tcPr/>
+          <w:p>
+            <w:pPr>
+              <w:pStyle w:val="Compact"/>
+            </w:pPr>
+            <w:r>
+              <w:t xml:space="preserve">Reconocimiento del endpoint de login (esperado)</w:t>
+            </w:r>
+          </w:p>
+        </w:tc>
+      </w:tr>
+    </w:tbl>
     <w:p>
       <w:pPr>
         <w:pStyle w:val="BodyText"/>
@@ -144,7 +408,7 @@
         <w:t xml:space="preserve">Próximo paso recomendado</w:t>
       </w:r>
       <w:r>
-        <w:t xml:space="preserve">: pentest externo formal con un equipo independiente.</w:t>
+        <w:t xml:space="preserve">: pentest externo formal con un equipo independiente, cuando el cliente lo defina según sus requisitos. La presente auditoría no reemplaza dicha evaluación.</w:t>
       </w:r>
     </w:p>
     <w:p>
@@ -155,7 +419,7 @@
       </w:r>
     </w:p>
     <w:bookmarkEnd w:id="9"/>
-    <w:bookmarkStart w:id="11" w:name="X70176dfd4083b9e5f625a28aac6c1a73d1a9391"/>
+    <w:bookmarkStart w:id="13" w:name="metodología"/>
     <w:p>
       <w:pPr>
         <w:pStyle w:val="Heading2"/>
@@ -167,12 +431,13 @@
     <w:tbl>
       <w:tblPr>
         <w:tblStyle w:val="Table"/>
-        <w:tblW w:type="auto" w:w="0"/>
+        <w:tblW w:type="pct" w:w="5000"/>
+        <w:tblLayout w:type="fixed"/>
         <w:tblLook w:firstRow="1" w:lastRow="0" w:firstColumn="0" w:lastColumn="0" w:noHBand="0" w:noVBand="0" w:val="0020"/>
       </w:tblPr>
       <w:tblGrid>
-        <w:gridCol w:w="3960"/>
-        <w:gridCol w:w="3960"/>
+        <w:gridCol w:w="2299"/>
+        <w:gridCol w:w="5620"/>
       </w:tblGrid>
       <w:tr>
         <w:trPr>
@@ -196,7 +461,7 @@
               <w:pStyle w:val="Compact"/>
             </w:pPr>
             <w:r>
-              <w:t xml:space="preserve">Detalle</w:t>
+              <w:t xml:space="preserve">Herramienta / detalle</w:t>
             </w:r>
           </w:p>
         </w:tc>
@@ -268,18 +533,88 @@
               <w:pStyle w:val="Compact"/>
             </w:pPr>
             <w:r>
-              <w:t xml:space="preserve">Tests dinámicos (runtime)</w:t>
-            </w:r>
-          </w:p>
-        </w:tc>
-        <w:tc>
-          <w:tcPr/>
-          <w:p>
-            <w:pPr>
-              <w:pStyle w:val="Compact"/>
-            </w:pPr>
-            <w:r>
-              <w:t xml:space="preserve">Ejecución de flujos completos con usuarios sintéticos creados específicamente para la auditoría, en entorno aislado de Azure SQL</w:t>
+              <w:t xml:space="preserve">Fuzzing de API basado en especificación</w:t>
+            </w:r>
+          </w:p>
+        </w:tc>
+        <w:tc>
+          <w:tcPr/>
+          <w:p>
+            <w:pPr>
+              <w:pStyle w:val="Compact"/>
+            </w:pPr>
+            <w:hyperlink r:id="rId11">
+              <w:r>
+                <w:rPr>
+                  <w:rStyle w:val="Hyperlink"/>
+                </w:rPr>
+                <w:t xml:space="preserve">Schemathesis</w:t>
+              </w:r>
+            </w:hyperlink>
+            <w:r>
+              <w:t xml:space="preserve"> </w:t>
+            </w:r>
+            <w:r>
+              <w:t xml:space="preserve">v4 — ejecución contra el contrato OpenAPI 3.0 de la API (257 operaciones, 218 casos de prueba generados)</w:t>
+            </w:r>
+          </w:p>
+        </w:tc>
+      </w:tr>
+      <w:tr>
+        <w:tc>
+          <w:tcPr/>
+          <w:p>
+            <w:pPr>
+              <w:pStyle w:val="Compact"/>
+            </w:pPr>
+            <w:r>
+              <w:t xml:space="preserve">Pruebas dinámicas dirigidas (custom)</w:t>
+            </w:r>
+          </w:p>
+        </w:tc>
+        <w:tc>
+          <w:tcPr/>
+          <w:p>
+            <w:pPr>
+              <w:pStyle w:val="Compact"/>
+            </w:pPr>
+            <w:r>
+              <w:t xml:space="preserve">Scripts ad-hoc para vectores específicos: aislamiento cross-proyecto, mass assignment, header injection, race conditions sobre transiciones de estado</w:t>
+            </w:r>
+          </w:p>
+        </w:tc>
+      </w:tr>
+      <w:tr>
+        <w:tc>
+          <w:tcPr/>
+          <w:p>
+            <w:pPr>
+              <w:pStyle w:val="Compact"/>
+            </w:pPr>
+            <w:r>
+              <w:t xml:space="preserve">Escaneo pasivo de la superficie HTTP</w:t>
+            </w:r>
+          </w:p>
+        </w:tc>
+        <w:tc>
+          <w:tcPr/>
+          <w:p>
+            <w:pPr>
+              <w:pStyle w:val="Compact"/>
+            </w:pPr>
+            <w:hyperlink r:id="rId12">
+              <w:r>
+                <w:rPr>
+                  <w:rStyle w:val="Hyperlink"/>
+                </w:rPr>
+                <w:t xml:space="preserve">OWASP ZAP</w:t>
+              </w:r>
+            </w:hyperlink>
+            <w:r>
+              <w:t xml:space="preserve"> </w:t>
+            </w:r>
+            <w:r>
+              <w:t xml:space="preserve">2.17 — passive scan baseline sobre toda la API (232 URLs cubiertas)</w:t>
             </w:r>
           </w:p>
         </w:tc>
@@ -303,7 +638,7 @@
               <w:pStyle w:val="Compact"/>
             </w:pPr>
             <w:r>
-              <w:t xml:space="preserve">Revisión de configuración de Azure App Service, App Registration en Entra ID, Identity, Azure Blob Storage</w:t>
+              <w:t xml:space="preserve">Revisión de Azure App Service, App Registration en Entra ID, Identity, Azure Blob Storage</w:t>
             </w:r>
           </w:p>
         </w:tc>
@@ -333,6 +668,14 @@
         </w:tc>
       </w:tr>
     </w:tbl>
+    <w:p>
+      <w:pPr>
+        <w:pStyle w:val="BodyText"/>
+      </w:pPr>
+      <w:r>
+        <w:t xml:space="preserve">Las pruebas se ejecutaron en entorno aislado, con usuarios sintéticos creados específicamente para la auditoría. Los artefactos de prueba fueron eliminados al cierre.</w:t>
+      </w:r>
+    </w:p>
     <w:p>
       <w:r>
         <w:pict>
@@ -340,8 +683,8 @@
         </w:pict>
       </w:r>
     </w:p>
-    <w:bookmarkEnd w:id="11"/>
-    <w:bookmarkStart w:id="12" w:name="X001b7e304dacb38fb23c2f5b111d3c288f07516"/>
+    <w:bookmarkEnd w:id="13"/>
+    <w:bookmarkStart w:id="14" w:name="stack-auditado"/>
     <w:p>
       <w:pPr>
         <w:pStyle w:val="Heading2"/>
@@ -353,12 +696,13 @@
     <w:tbl>
       <w:tblPr>
         <w:tblStyle w:val="Table"/>
-        <w:tblW w:type="auto" w:w="0"/>
+        <w:tblW w:type="pct" w:w="5000"/>
+        <w:tblLayout w:type="fixed"/>
         <w:tblLook w:firstRow="1" w:lastRow="0" w:firstColumn="0" w:lastColumn="0" w:noHBand="0" w:noVBand="0" w:val="0020"/>
       </w:tblPr>
       <w:tblGrid>
-        <w:gridCol w:w="3960"/>
-        <w:gridCol w:w="3960"/>
+        <w:gridCol w:w="2795"/>
+        <w:gridCol w:w="5124"/>
       </w:tblGrid>
       <w:tr>
         <w:trPr>
@@ -563,8 +907,8 @@
         </w:pict>
       </w:r>
     </w:p>
-    <w:bookmarkEnd w:id="12"/>
-    <w:bookmarkStart w:id="24" w:name="X5b7db49a345785cb70f31ddd11bc04be57468f7"/>
+    <w:bookmarkEnd w:id="14"/>
+    <w:bookmarkStart w:id="27" w:name="resultados-de-la-auditoría"/>
     <w:p>
       <w:pPr>
         <w:pStyle w:val="Heading2"/>
@@ -573,7 +917,7 @@
         <w:t xml:space="preserve">4. Resultados de la auditoría</w:t>
       </w:r>
     </w:p>
-    <w:bookmarkStart w:id="17" w:name="Xc9411e9bf39b5e192b645df71f5898dce274163"/>
+    <w:bookmarkStart w:id="19" w:name="X94a3c0c1523d7de47616d61785d74c03812e92c"/>
     <w:p>
       <w:pPr>
         <w:pStyle w:val="Heading3"/>
@@ -603,7 +947,7 @@
         <w:t xml:space="preserve">:</w:t>
       </w:r>
     </w:p>
-    <w:bookmarkStart w:id="13" w:name="máquinas-de-estado-del-flujo-de-negocio"/>
+    <w:bookmarkStart w:id="15" w:name="máquinas-de-estado-del-flujo-de-negocio"/>
     <w:p>
       <w:pPr>
         <w:pStyle w:val="Heading4"/>
@@ -623,13 +967,14 @@
     <w:tbl>
       <w:tblPr>
         <w:tblStyle w:val="Table"/>
-        <w:tblW w:type="auto" w:w="0"/>
+        <w:tblW w:type="pct" w:w="5000"/>
+        <w:tblLayout w:type="fixed"/>
         <w:tblLook w:firstRow="1" w:lastRow="0" w:firstColumn="0" w:lastColumn="0" w:noHBand="0" w:noVBand="0" w:val="0020"/>
       </w:tblPr>
       <w:tblGrid>
-        <w:gridCol w:w="2640"/>
-        <w:gridCol w:w="2640"/>
-        <w:gridCol w:w="2640"/>
+        <w:gridCol w:w="1760"/>
+        <w:gridCol w:w="4224"/>
+        <w:gridCol w:w="1936"/>
       </w:tblGrid>
       <w:tr>
         <w:trPr>
@@ -811,23 +1156,52 @@
           <w:b/>
           <w:bCs/>
         </w:rPr>
-        <w:t xml:space="preserve">No se encontraron vectores de "salto de estados"</w:t>
-      </w:r>
-      <w:r>
+        <w:t xml:space="preserve">No se encontraron vectores de</w:t>
+      </w:r>
+      <w:r>
+        <w:rPr>
+          <w:b/>
+          <w:bCs/>
+        </w:rPr>
         <w:t xml:space="preserve"> </w:t>
       </w:r>
       <w:r>
-        <w:t xml:space="preserve">(por ejemplo, completar una tarea sin iniciarla, firmar un registro sin completarlo, aprobar un pendiente saltando el flujo de aprobación). La implementación de la lógica de negocio es sólida.</w:t>
-      </w:r>
-    </w:p>
-    <w:bookmarkEnd w:id="13"/>
-    <w:bookmarkStart w:id="14" w:name="aislamiento-entre-proyectos"/>
+        <w:rPr>
+          <w:b/>
+          <w:bCs/>
+        </w:rPr>
+        <w:t xml:space="preserve">“salto de estados”</w:t>
+      </w:r>
+      <w:r>
+        <w:t xml:space="preserve"> </w:t>
+      </w:r>
+      <w:r>
+        <w:t xml:space="preserve">(por ejemplo, completar una tarea sin iniciarla, firmar un registro sin completarlo, aprobar un pendiente saltando el flujo de aprobación).</w:t>
+      </w:r>
+    </w:p>
+    <w:p>
+      <w:pPr>
+        <w:pStyle w:val="BodyText"/>
+      </w:pPr>
+      <w:r>
+        <w:rPr>
+          <w:b/>
+          <w:bCs/>
+        </w:rPr>
+        <w:t xml:space="preserve">Resistencia ante concurrencia</w:t>
+      </w:r>
+      <w:r>
+        <w:t xml:space="preserve">: se ejecutaron pruebas de modificación concurrente (10 requests simultáneos sobre la misma entidad). En todos los casos, las restricciones de unicidad e índices únicos de la base de datos preservaron la integridad de los datos. No se generaron duplicados ni estados inconsistentes.</w:t>
+      </w:r>
+    </w:p>
+    <w:bookmarkEnd w:id="15"/>
+    <w:bookmarkStart w:id="16" w:name="aislamiento-entre-proyectos-bola-idor"/>
     <w:p>
       <w:pPr>
         <w:pStyle w:val="Heading4"/>
       </w:pPr>
       <w:r>
-        <w:t xml:space="preserve">Aislamiento entre proyectos</w:t>
+        <w:t xml:space="preserve">Aislamiento entre proyectos (BOLA / IDOR)</w:t>
       </w:r>
     </w:p>
     <w:p>
@@ -835,7 +1209,7 @@
         <w:pStyle w:val="FirstParagraph"/>
       </w:pPr>
       <w:r>
-        <w:t xml:space="preserve">El modelo de acceso multi-proyecto fue auditado y reforzado. El sistema cuenta ahora con un mecanismo automático a nivel de Entity Framework que garantiza que un usuario solo accede a los datos de los proyectos a los que está explícitamente asignado (a través de la tabla</w:t>
+        <w:t xml:space="preserve">El modelo de acceso multi-proyecto fue auditado y reforzado. El sistema cuenta con un mecanismo automático a nivel de Entity Framework que garantiza que un usuario solo accede a los datos de los proyectos a los que está explícitamente asignado (a través de la tabla</w:t>
       </w:r>
       <w:r>
         <w:t xml:space="preserve"> </w:t>
@@ -859,14 +1233,376 @@
           <w:b/>
           <w:bCs/>
         </w:rPr>
-        <w:t xml:space="preserve">Validación runtime</w:t>
-      </w:r>
-      <w:r>
-        <w:t xml:space="preserve">: se ejecutaron pruebas cruzadas con usuarios pertenecientes a proyectos distintos. En todos los casos, los intentos de acceso a recursos fuera del alcance del usuario fueron correctamente rechazados con HTTP 404, sin filtración de información.</w:t>
-      </w:r>
-    </w:p>
-    <w:bookmarkEnd w:id="14"/>
-    <w:bookmarkStart w:id="15" w:name="protección-de-credenciales"/>
+        <w:t xml:space="preserve">Validación runtime — pruebas dirigidas de autorización cruzada</w:t>
+      </w:r>
+      <w:r>
+        <w:t xml:space="preserve">:</w:t>
+      </w:r>
+    </w:p>
+    <w:tbl>
+      <w:tblPr>
+        <w:tblStyle w:val="Table"/>
+        <w:tblW w:type="pct" w:w="5000"/>
+        <w:tblLayout w:type="fixed"/>
+        <w:tblLook w:firstRow="1" w:lastRow="0" w:firstColumn="0" w:lastColumn="0" w:noHBand="0" w:noVBand="0" w:val="0020"/>
+      </w:tblPr>
+      <w:tblGrid>
+        <w:gridCol w:w="3009"/>
+        <w:gridCol w:w="3168"/>
+        <w:gridCol w:w="1742"/>
+      </w:tblGrid>
+      <w:tr>
+        <w:trPr>
+          <w:tblHeader w:val="on"/>
+        </w:trPr>
+        <w:tc>
+          <w:tcPr/>
+          <w:p>
+            <w:pPr>
+              <w:pStyle w:val="Compact"/>
+            </w:pPr>
+            <w:r>
+              <w:t xml:space="preserve">Endpoint testeado</w:t>
+            </w:r>
+          </w:p>
+        </w:tc>
+        <w:tc>
+          <w:tcPr/>
+          <w:p>
+            <w:pPr>
+              <w:pStyle w:val="Compact"/>
+            </w:pPr>
+            <w:r>
+              <w:t xml:space="preserve">Acción del atacante</w:t>
+            </w:r>
+          </w:p>
+        </w:tc>
+        <w:tc>
+          <w:tcPr/>
+          <w:p>
+            <w:pPr>
+              <w:pStyle w:val="Compact"/>
+            </w:pPr>
+            <w:r>
+              <w:t xml:space="preserve">Resultado</w:t>
+            </w:r>
+          </w:p>
+        </w:tc>
+      </w:tr>
+      <w:tr>
+        <w:tc>
+          <w:tcPr/>
+          <w:p>
+            <w:pPr>
+              <w:pStyle w:val="Compact"/>
+            </w:pPr>
+            <w:r>
+              <w:rPr>
+                <w:rStyle w:val="VerbatimChar"/>
+              </w:rPr>
+              <w:t xml:space="preserve">GET /elementos-tareas/{id}</w:t>
+            </w:r>
+          </w:p>
+        </w:tc>
+        <w:tc>
+          <w:tcPr/>
+          <w:p>
+            <w:pPr>
+              <w:pStyle w:val="Compact"/>
+            </w:pPr>
+            <w:r>
+              <w:t xml:space="preserve">Usuario del proyecto A solicita tarea del proyecto B</w:t>
+            </w:r>
+          </w:p>
+        </w:tc>
+        <w:tc>
+          <w:tcPr/>
+          <w:p>
+            <w:pPr>
+              <w:pStyle w:val="Compact"/>
+            </w:pPr>
+            <w:r>
+              <w:t xml:space="preserve">✅ 404 (no se filtra ni la existencia)</w:t>
+            </w:r>
+          </w:p>
+        </w:tc>
+      </w:tr>
+      <w:tr>
+        <w:tc>
+          <w:tcPr/>
+          <w:p>
+            <w:pPr>
+              <w:pStyle w:val="Compact"/>
+            </w:pPr>
+            <w:r>
+              <w:rPr>
+                <w:rStyle w:val="VerbatimChar"/>
+              </w:rPr>
+              <w:t xml:space="preserve">PUT /elementos-tareas/{id}</w:t>
+            </w:r>
+          </w:p>
+        </w:tc>
+        <w:tc>
+          <w:tcPr/>
+          <w:p>
+            <w:pPr>
+              <w:pStyle w:val="Compact"/>
+            </w:pPr>
+            <w:r>
+              <w:t xml:space="preserve">Modificar tarea de proyecto ajeno</w:t>
+            </w:r>
+          </w:p>
+        </w:tc>
+        <w:tc>
+          <w:tcPr/>
+          <w:p>
+            <w:pPr>
+              <w:pStyle w:val="Compact"/>
+            </w:pPr>
+            <w:r>
+              <w:t xml:space="preserve">✅ 404</w:t>
+            </w:r>
+          </w:p>
+        </w:tc>
+      </w:tr>
+      <w:tr>
+        <w:tc>
+          <w:tcPr/>
+          <w:p>
+            <w:pPr>
+              <w:pStyle w:val="Compact"/>
+            </w:pPr>
+            <w:r>
+              <w:rPr>
+                <w:rStyle w:val="VerbatimChar"/>
+              </w:rPr>
+              <w:t xml:space="preserve">POST /elementos-tareas/{id}/iniciar</w:t>
+            </w:r>
+            <w:r>
+              <w:t xml:space="preserve">,</w:t>
+            </w:r>
+            <w:r>
+              <w:t xml:space="preserve"> </w:t>
+            </w:r>
+            <w:r>
+              <w:rPr>
+                <w:rStyle w:val="VerbatimChar"/>
+              </w:rPr>
+              <w:t xml:space="preserve">/completar</w:t>
+            </w:r>
+            <w:r>
+              <w:t xml:space="preserve">,</w:t>
+            </w:r>
+            <w:r>
+              <w:t xml:space="preserve"> </w:t>
+            </w:r>
+            <w:r>
+              <w:rPr>
+                <w:rStyle w:val="VerbatimChar"/>
+              </w:rPr>
+              <w:t xml:space="preserve">/cancelar</w:t>
+            </w:r>
+          </w:p>
+        </w:tc>
+        <w:tc>
+          <w:tcPr/>
+          <w:p>
+            <w:pPr>
+              <w:pStyle w:val="Compact"/>
+            </w:pPr>
+            <w:r>
+              <w:t xml:space="preserve">Disparar transiciones de estado en proyecto ajeno</w:t>
+            </w:r>
+          </w:p>
+        </w:tc>
+        <w:tc>
+          <w:tcPr/>
+          <w:p>
+            <w:pPr>
+              <w:pStyle w:val="Compact"/>
+            </w:pPr>
+            <w:r>
+              <w:t xml:space="preserve">✅ 404 en todos los casos</w:t>
+            </w:r>
+          </w:p>
+        </w:tc>
+      </w:tr>
+      <w:tr>
+        <w:tc>
+          <w:tcPr/>
+          <w:p>
+            <w:pPr>
+              <w:pStyle w:val="Compact"/>
+            </w:pPr>
+            <w:r>
+              <w:rPr>
+                <w:rStyle w:val="VerbatimChar"/>
+              </w:rPr>
+              <w:t xml:space="preserve">GET /pendientes/{id}</w:t>
+            </w:r>
+          </w:p>
+        </w:tc>
+        <w:tc>
+          <w:tcPr/>
+          <w:p>
+            <w:pPr>
+              <w:pStyle w:val="Compact"/>
+            </w:pPr>
+            <w:r>
+              <w:t xml:space="preserve">Lectura cruzada</w:t>
+            </w:r>
+          </w:p>
+        </w:tc>
+        <w:tc>
+          <w:tcPr/>
+          <w:p>
+            <w:pPr>
+              <w:pStyle w:val="Compact"/>
+            </w:pPr>
+            <w:r>
+              <w:t xml:space="preserve">✅ 404</w:t>
+            </w:r>
+          </w:p>
+        </w:tc>
+      </w:tr>
+      <w:tr>
+        <w:tc>
+          <w:tcPr/>
+          <w:p>
+            <w:pPr>
+              <w:pStyle w:val="Compact"/>
+            </w:pPr>
+            <w:r>
+              <w:rPr>
+                <w:rStyle w:val="VerbatimChar"/>
+              </w:rPr>
+              <w:t xml:space="preserve">POST /pendientes/{id}/comentarios</w:t>
+            </w:r>
+          </w:p>
+        </w:tc>
+        <w:tc>
+          <w:tcPr/>
+          <w:p>
+            <w:pPr>
+              <w:pStyle w:val="Compact"/>
+            </w:pPr>
+            <w:r>
+              <w:t xml:space="preserve">Inyectar comentarios en pendiente ajeno</w:t>
+            </w:r>
+          </w:p>
+        </w:tc>
+        <w:tc>
+          <w:tcPr/>
+          <w:p>
+            <w:pPr>
+              <w:pStyle w:val="Compact"/>
+            </w:pPr>
+            <w:r>
+              <w:t xml:space="preserve">✅ 400 (bloqueado a nivel de servicio)</w:t>
+            </w:r>
+          </w:p>
+        </w:tc>
+      </w:tr>
+      <w:tr>
+        <w:tc>
+          <w:tcPr/>
+          <w:p>
+            <w:pPr>
+              <w:pStyle w:val="Compact"/>
+            </w:pPr>
+            <w:r>
+              <w:rPr>
+                <w:rStyle w:val="VerbatimChar"/>
+              </w:rPr>
+              <w:t xml:space="preserve">POST /pendientes/{id}/cancelar</w:t>
+            </w:r>
+          </w:p>
+        </w:tc>
+        <w:tc>
+          <w:tcPr/>
+          <w:p>
+            <w:pPr>
+              <w:pStyle w:val="Compact"/>
+            </w:pPr>
+            <w:r>
+              <w:t xml:space="preserve">Forzar transición en pendiente ajeno</w:t>
+            </w:r>
+          </w:p>
+        </w:tc>
+        <w:tc>
+          <w:tcPr/>
+          <w:p>
+            <w:pPr>
+              <w:pStyle w:val="Compact"/>
+            </w:pPr>
+            <w:r>
+              <w:t xml:space="preserve">✅ 403</w:t>
+            </w:r>
+          </w:p>
+        </w:tc>
+      </w:tr>
+      <w:tr>
+        <w:tc>
+          <w:tcPr/>
+          <w:p>
+            <w:pPr>
+              <w:pStyle w:val="Compact"/>
+            </w:pPr>
+            <w:r>
+              <w:rPr>
+                <w:rStyle w:val="VerbatimChar"/>
+              </w:rPr>
+              <w:t xml:space="preserve">GET /pendientes/{id}/adjuntos</w:t>
+            </w:r>
+          </w:p>
+        </w:tc>
+        <w:tc>
+          <w:tcPr/>
+          <w:p>
+            <w:pPr>
+              <w:pStyle w:val="Compact"/>
+            </w:pPr>
+            <w:r>
+              <w:t xml:space="preserve">Lectura de adjuntos cruzados</w:t>
+            </w:r>
+          </w:p>
+        </w:tc>
+        <w:tc>
+          <w:tcPr/>
+          <w:p>
+            <w:pPr>
+              <w:pStyle w:val="Compact"/>
+            </w:pPr>
+            <w:r>
+              <w:t xml:space="preserve">✅ 404</w:t>
+            </w:r>
+          </w:p>
+        </w:tc>
+      </w:tr>
+    </w:tbl>
+    <w:p>
+      <w:pPr>
+        <w:pStyle w:val="BodyText"/>
+      </w:pPr>
+      <w:r>
+        <w:t xml:space="preserve">En todos los casos, el recurso ajeno permaneció</w:t>
+      </w:r>
+      <w:r>
+        <w:t xml:space="preserve"> </w:t>
+      </w:r>
+      <w:r>
+        <w:rPr>
+          <w:b/>
+          <w:bCs/>
+        </w:rPr>
+        <w:t xml:space="preserve">intacto e inaccesible</w:t>
+      </w:r>
+      <w:r>
+        <w:t xml:space="preserve">, sin filtración de información sobre su existencia.</w:t>
+      </w:r>
+    </w:p>
+    <w:bookmarkEnd w:id="16"/>
+    <w:bookmarkStart w:id="17" w:name="protección-de-credenciales"/>
     <w:p>
       <w:pPr>
         <w:pStyle w:val="Heading4"/>
@@ -884,7 +1620,7 @@
         </w:numPr>
       </w:pPr>
       <w:r>
-        <w:t xml:space="preserve">Las credenciales de servicios externos (Azure SQL, Microsoft Entra ID, Google OAuth, Azure Blob Storage) están aisladas del código fuente y gestionadas vía .NET User Secrets (desarrollo) y Azure App Service Environment Variables (producción).</w:t>
+        <w:t xml:space="preserve">Las credenciales de servicios externos están aisladas del código fuente y gestionadas vía .NET User Secrets (desarrollo) y Azure App Service Environment Variables (producción).</w:t>
       </w:r>
     </w:p>
     <w:p>
@@ -896,7 +1632,20 @@
         </w:numPr>
       </w:pPr>
       <w:r>
-        <w:t xml:space="preserve">Las claves criptográficas del sistema de tokens fueron rotadas como parte del proceso de hardening.</w:t>
+        <w:t xml:space="preserve">Las claves criptográficas del sistema de tokens y las credenciales de servicios externos (Azure SQL, Microsoft Entra ID, Google OAuth, Azure Blob Storage, servicios de IA) fueron</w:t>
+      </w:r>
+      <w:r>
+        <w:t xml:space="preserve"> </w:t>
+      </w:r>
+      <w:r>
+        <w:rPr>
+          <w:b/>
+          <w:bCs/>
+        </w:rPr>
+        <w:t xml:space="preserve">rotadas como parte del proceso de hardening</w:t>
+      </w:r>
+      <w:r>
+        <w:t xml:space="preserve">.</w:t>
       </w:r>
     </w:p>
     <w:p>
@@ -908,17 +1657,17 @@
         </w:numPr>
       </w:pPr>
       <w:r>
-        <w:t xml:space="preserve">La aplicación está configurada para mantener un rotación periódica de credenciales (recomendación operativa).</w:t>
-      </w:r>
-    </w:p>
-    <w:bookmarkEnd w:id="15"/>
-    <w:bookmarkStart w:id="16" w:name="validación-de-inyección"/>
+        <w:t xml:space="preserve">Configuración preparada para rotación periódica futura.</w:t>
+      </w:r>
+    </w:p>
+    <w:bookmarkEnd w:id="17"/>
+    <w:bookmarkStart w:id="18" w:name="validación-de-inyección-sql"/>
     <w:p>
       <w:pPr>
         <w:pStyle w:val="Heading4"/>
       </w:pPr>
       <w:r>
-        <w:t xml:space="preserve">Validación de inyección</w:t>
+        <w:t xml:space="preserve">Validación de inyección SQL</w:t>
       </w:r>
     </w:p>
     <w:p>
@@ -926,7 +1675,7 @@
         <w:pStyle w:val="FirstParagraph"/>
       </w:pPr>
       <w:r>
-        <w:t xml:space="preserve">No se detectaron vectores de inyección SQL en el código auditado. Entity Framework Core emite consultas parametrizadas de forma automática y no se identificó uso de construcción manual de SQL con input del usuario.</w:t>
+        <w:t xml:space="preserve">No se detectaron vectores de inyección SQL en el código auditado. Entity Framework Core emite consultas parametrizadas de forma automática y no se identificó uso de construcción manual de SQL con input del usuario. El fuzzing automatizado con payloads de SQL injection no produjo respuestas que sugieran ejecución de código SQL inyectado.</w:t>
       </w:r>
     </w:p>
     <w:p>
@@ -936,9 +1685,9 @@
         </w:pict>
       </w:r>
     </w:p>
-    <w:bookmarkEnd w:id="16"/>
-    <w:bookmarkEnd w:id="17"/>
-    <w:bookmarkStart w:id="22" w:name="X92e427ff2d26dd7d429ef6c56e177773edfe574"/>
+    <w:bookmarkEnd w:id="18"/>
+    <w:bookmarkEnd w:id="19"/>
+    <w:bookmarkStart w:id="25" w:name="mejoras-de-hardening-aplicadas"/>
     <w:p>
       <w:pPr>
         <w:pStyle w:val="Heading3"/>
@@ -965,10 +1714,10 @@
         <w:t xml:space="preserve">defensa en profundidad</w:t>
       </w:r>
       <w:r>
-        <w:t xml:space="preserve">. Se trata principalmente de endurecimientos preventivos y mejores prácticas; ninguno representó un riesgo activo explotable al momento de la auditoría.</w:t>
-      </w:r>
-    </w:p>
-    <w:bookmarkStart w:id="18" w:name="capa-de-transporte-y-headers"/>
+        <w:t xml:space="preserve">. Se trata principalmente de endurecimientos preventivos y mejores prácticas.</w:t>
+      </w:r>
+    </w:p>
+    <w:bookmarkStart w:id="20" w:name="capa-de-transporte-y-headers"/>
     <w:p>
       <w:pPr>
         <w:pStyle w:val="Heading4"/>
@@ -980,13 +1729,14 @@
     <w:tbl>
       <w:tblPr>
         <w:tblStyle w:val="Table"/>
-        <w:tblW w:type="auto" w:w="0"/>
+        <w:tblW w:type="pct" w:w="5000"/>
+        <w:tblLayout w:type="fixed"/>
         <w:tblLook w:firstRow="1" w:lastRow="0" w:firstColumn="0" w:lastColumn="0" w:noHBand="0" w:noVBand="0" w:val="0020"/>
       </w:tblPr>
       <w:tblGrid>
-        <w:gridCol w:w="2640"/>
-        <w:gridCol w:w="2640"/>
-        <w:gridCol w:w="2640"/>
+        <w:gridCol w:w="1080"/>
+        <w:gridCol w:w="2880"/>
+        <w:gridCol w:w="3960"/>
       </w:tblGrid>
       <w:tr>
         <w:trPr>
@@ -1287,8 +2037,8 @@
         </w:tc>
       </w:tr>
     </w:tbl>
-    <w:bookmarkEnd w:id="18"/>
-    <w:bookmarkStart w:id="19" w:name="capa-de-autenticación-y-autorización"/>
+    <w:bookmarkEnd w:id="20"/>
+    <w:bookmarkStart w:id="21" w:name="capa-de-autenticación-y-autorización"/>
     <w:p>
       <w:pPr>
         <w:pStyle w:val="Heading4"/>
@@ -1300,13 +2050,14 @@
     <w:tbl>
       <w:tblPr>
         <w:tblStyle w:val="Table"/>
-        <w:tblW w:type="auto" w:w="0"/>
+        <w:tblW w:type="pct" w:w="5000"/>
+        <w:tblLayout w:type="fixed"/>
         <w:tblLook w:firstRow="1" w:lastRow="0" w:firstColumn="0" w:lastColumn="0" w:noHBand="0" w:noVBand="0" w:val="0020"/>
       </w:tblPr>
       <w:tblGrid>
-        <w:gridCol w:w="2640"/>
-        <w:gridCol w:w="2640"/>
-        <w:gridCol w:w="2640"/>
+        <w:gridCol w:w="1080"/>
+        <w:gridCol w:w="2880"/>
+        <w:gridCol w:w="3960"/>
       </w:tblGrid>
       <w:tr>
         <w:trPr>
@@ -1653,26 +2404,27 @@
         </w:tc>
       </w:tr>
     </w:tbl>
-    <w:bookmarkEnd w:id="19"/>
-    <w:bookmarkStart w:id="20" w:name="capa-de-manejo-de-archivos-y-urls"/>
+    <w:bookmarkEnd w:id="21"/>
+    <w:bookmarkStart w:id="22" w:name="capa-de-manejo-de-datos-y-propiedades"/>
     <w:p>
       <w:pPr>
         <w:pStyle w:val="Heading4"/>
       </w:pPr>
       <w:r>
-        <w:t xml:space="preserve">Capa de manejo de archivos y URLs</w:t>
+        <w:t xml:space="preserve">Capa de manejo de datos y propiedades</w:t>
       </w:r>
     </w:p>
     <w:tbl>
       <w:tblPr>
         <w:tblStyle w:val="Table"/>
-        <w:tblW w:type="auto" w:w="0"/>
+        <w:tblW w:type="pct" w:w="5000"/>
+        <w:tblLayout w:type="fixed"/>
         <w:tblLook w:firstRow="1" w:lastRow="0" w:firstColumn="0" w:lastColumn="0" w:noHBand="0" w:noVBand="0" w:val="0020"/>
       </w:tblPr>
       <w:tblGrid>
-        <w:gridCol w:w="2640"/>
-        <w:gridCol w:w="2640"/>
-        <w:gridCol w:w="2640"/>
+        <w:gridCol w:w="1080"/>
+        <w:gridCol w:w="2880"/>
+        <w:gridCol w:w="3960"/>
       </w:tblGrid>
       <w:tr>
         <w:trPr>
@@ -1731,18 +2483,18 @@
               <w:pStyle w:val="Compact"/>
             </w:pPr>
             <w:r>
-              <w:t xml:space="preserve">Validación de uploads con triple capa: whitelist de extensión + verificación de Content-Type + verificación de "magic bytes" (firma binaria del archivo)</w:t>
-            </w:r>
-          </w:p>
-        </w:tc>
-        <w:tc>
-          <w:tcPr/>
-          <w:p>
-            <w:pPr>
-              <w:pStyle w:val="Compact"/>
-            </w:pPr>
-            <w:r>
-              <w:t xml:space="preserve">Defensa contra subida de archivos disfrazados (p.ej. ejecutables con extensión PDF)</w:t>
+              <w:t xml:space="preserve">DTOs de auto-edición acotados a campos seguros, con configuración explícita del mapeador de objetos para ignorar campos sensibles (campos de tenencia, identidad, autenticación)</w:t>
+            </w:r>
+          </w:p>
+        </w:tc>
+        <w:tc>
+          <w:tcPr/>
+          <w:p>
+            <w:pPr>
+              <w:pStyle w:val="Compact"/>
+            </w:pPr>
+            <w:r>
+              <w:t xml:space="preserve">Defensa en profundidad contra asignación masiva de propiedades (OWASP API3)</w:t>
             </w:r>
           </w:p>
         </w:tc>
@@ -1766,18 +2518,18 @@
               <w:pStyle w:val="Compact"/>
             </w:pPr>
             <w:r>
-              <w:t xml:space="preserve">Limite máximo configurable para tiempo de expiración de URLs temporales (SAS)</w:t>
-            </w:r>
-          </w:p>
-        </w:tc>
-        <w:tc>
-          <w:tcPr/>
-          <w:p>
-            <w:pPr>
-              <w:pStyle w:val="Compact"/>
-            </w:pPr>
-            <w:r>
-              <w:t xml:space="preserve">Defensa contra abuso de URLs de larga duración para exfiltración de datos</w:t>
+              <w:t xml:space="preserve">Validación estricta de inputs recibidos por headers HTTP (formato + longitud)</w:t>
+            </w:r>
+          </w:p>
+        </w:tc>
+        <w:tc>
+          <w:tcPr/>
+          <w:p>
+            <w:pPr>
+              <w:pStyle w:val="Compact"/>
+            </w:pPr>
+            <w:r>
+              <w:t xml:space="preserve">Defensa contra inyección de contenido malicioso persistido vía headers</w:t>
             </w:r>
           </w:p>
         </w:tc>
@@ -1801,43 +2553,44 @@
               <w:pStyle w:val="Compact"/>
             </w:pPr>
             <w:r>
-              <w:t xml:space="preserve">Validación de dominio destino antes de redirecciones HTTP automáticas</w:t>
-            </w:r>
-          </w:p>
-        </w:tc>
-        <w:tc>
-          <w:tcPr/>
-          <w:p>
-            <w:pPr>
-              <w:pStyle w:val="Compact"/>
-            </w:pPr>
-            <w:r>
-              <w:t xml:space="preserve">Defensa en profundidad contra open redirect (no era explotable en código actual; medida preventiva)</w:t>
+              <w:t xml:space="preserve">Cuotas por usuario en endpoints que crean recursos automáticamente</w:t>
+            </w:r>
+          </w:p>
+        </w:tc>
+        <w:tc>
+          <w:tcPr/>
+          <w:p>
+            <w:pPr>
+              <w:pStyle w:val="Compact"/>
+            </w:pPr>
+            <w:r>
+              <w:t xml:space="preserve">Defensa contra agotamiento de recursos en escenarios autenticados</w:t>
             </w:r>
           </w:p>
         </w:tc>
       </w:tr>
     </w:tbl>
-    <w:bookmarkEnd w:id="20"/>
-    <w:bookmarkStart w:id="21" w:name="cleanup-operacional"/>
+    <w:bookmarkEnd w:id="22"/>
+    <w:bookmarkStart w:id="23" w:name="capa-de-manejo-de-archivos-y-urls"/>
     <w:p>
       <w:pPr>
         <w:pStyle w:val="Heading4"/>
       </w:pPr>
       <w:r>
-        <w:t xml:space="preserve">Cleanup operacional</w:t>
+        <w:t xml:space="preserve">Capa de manejo de archivos y URLs</w:t>
       </w:r>
     </w:p>
     <w:tbl>
       <w:tblPr>
         <w:tblStyle w:val="Table"/>
-        <w:tblW w:type="auto" w:w="0"/>
+        <w:tblW w:type="pct" w:w="5000"/>
+        <w:tblLayout w:type="fixed"/>
         <w:tblLook w:firstRow="1" w:lastRow="0" w:firstColumn="0" w:lastColumn="0" w:noHBand="0" w:noVBand="0" w:val="0020"/>
       </w:tblPr>
       <w:tblGrid>
-        <w:gridCol w:w="2640"/>
-        <w:gridCol w:w="2640"/>
-        <w:gridCol w:w="2640"/>
+        <w:gridCol w:w="1080"/>
+        <w:gridCol w:w="2880"/>
+        <w:gridCol w:w="3960"/>
       </w:tblGrid>
       <w:tr>
         <w:trPr>
@@ -1896,18 +2649,196 @@
               <w:pStyle w:val="Compact"/>
             </w:pPr>
             <w:r>
-              <w:t xml:space="preserve">Eliminación de endpoints y entidades demo del template de .NET no utilizadas</w:t>
-            </w:r>
-          </w:p>
-        </w:tc>
-        <w:tc>
-          <w:tcPr/>
-          <w:p>
-            <w:pPr>
-              <w:pStyle w:val="Compact"/>
-            </w:pPr>
-            <w:r>
-              <w:t xml:space="preserve">Reducción de superficie de ataque</w:t>
+              <w:t xml:space="preserve">Validación de uploads con triple capa: whitelist de extensión + verificación de Content-Type + verificación de</w:t>
+            </w:r>
+            <w:r>
+              <w:t xml:space="preserve"> </w:t>
+            </w:r>
+            <w:r>
+              <w:t xml:space="preserve">“magic bytes”</w:t>
+            </w:r>
+            <w:r>
+              <w:t xml:space="preserve"> </w:t>
+            </w:r>
+            <w:r>
+              <w:t xml:space="preserve">(firma binaria del archivo)</w:t>
+            </w:r>
+          </w:p>
+        </w:tc>
+        <w:tc>
+          <w:tcPr/>
+          <w:p>
+            <w:pPr>
+              <w:pStyle w:val="Compact"/>
+            </w:pPr>
+            <w:r>
+              <w:t xml:space="preserve">Defensa contra subida de archivos disfrazados (p.ej. ejecutables con extensión PDF)</w:t>
+            </w:r>
+          </w:p>
+        </w:tc>
+      </w:tr>
+      <w:tr>
+        <w:tc>
+          <w:tcPr/>
+          <w:p>
+            <w:pPr>
+              <w:pStyle w:val="Compact"/>
+            </w:pPr>
+            <w:r>
+              <w:t xml:space="preserve">15</w:t>
+            </w:r>
+          </w:p>
+        </w:tc>
+        <w:tc>
+          <w:tcPr/>
+          <w:p>
+            <w:pPr>
+              <w:pStyle w:val="Compact"/>
+            </w:pPr>
+            <w:r>
+              <w:t xml:space="preserve">Límite máximo configurable para tiempo de expiración de URLs temporales (SAS)</w:t>
+            </w:r>
+          </w:p>
+        </w:tc>
+        <w:tc>
+          <w:tcPr/>
+          <w:p>
+            <w:pPr>
+              <w:pStyle w:val="Compact"/>
+            </w:pPr>
+            <w:r>
+              <w:t xml:space="preserve">Defensa contra abuso de URLs de larga duración para exfiltración de datos</w:t>
+            </w:r>
+          </w:p>
+        </w:tc>
+      </w:tr>
+      <w:tr>
+        <w:tc>
+          <w:tcPr/>
+          <w:p>
+            <w:pPr>
+              <w:pStyle w:val="Compact"/>
+            </w:pPr>
+            <w:r>
+              <w:t xml:space="preserve">16</w:t>
+            </w:r>
+          </w:p>
+        </w:tc>
+        <w:tc>
+          <w:tcPr/>
+          <w:p>
+            <w:pPr>
+              <w:pStyle w:val="Compact"/>
+            </w:pPr>
+            <w:r>
+              <w:t xml:space="preserve">Validación de dominio destino antes de redirecciones HTTP automáticas</w:t>
+            </w:r>
+          </w:p>
+        </w:tc>
+        <w:tc>
+          <w:tcPr/>
+          <w:p>
+            <w:pPr>
+              <w:pStyle w:val="Compact"/>
+            </w:pPr>
+            <w:r>
+              <w:t xml:space="preserve">Defensa en profundidad contra open redirect</w:t>
+            </w:r>
+          </w:p>
+        </w:tc>
+      </w:tr>
+    </w:tbl>
+    <w:bookmarkEnd w:id="23"/>
+    <w:bookmarkStart w:id="24" w:name="Xc19e96708d9cfed3b8055bbb36bbfe0eecc622b"/>
+    <w:p>
+      <w:pPr>
+        <w:pStyle w:val="Heading4"/>
+      </w:pPr>
+      <w:r>
+        <w:t xml:space="preserve">Cleanup operacional y reducción de superficie</w:t>
+      </w:r>
+    </w:p>
+    <w:tbl>
+      <w:tblPr>
+        <w:tblStyle w:val="Table"/>
+        <w:tblW w:type="pct" w:w="5000"/>
+        <w:tblLayout w:type="fixed"/>
+        <w:tblLook w:firstRow="1" w:lastRow="0" w:firstColumn="0" w:lastColumn="0" w:noHBand="0" w:noVBand="0" w:val="0020"/>
+      </w:tblPr>
+      <w:tblGrid>
+        <w:gridCol w:w="1080"/>
+        <w:gridCol w:w="2880"/>
+        <w:gridCol w:w="3960"/>
+      </w:tblGrid>
+      <w:tr>
+        <w:trPr>
+          <w:tblHeader w:val="on"/>
+        </w:trPr>
+        <w:tc>
+          <w:tcPr/>
+          <w:p>
+            <w:pPr>
+              <w:pStyle w:val="Compact"/>
+            </w:pPr>
+            <w:r>
+              <w:t xml:space="preserve">#</w:t>
+            </w:r>
+          </w:p>
+        </w:tc>
+        <w:tc>
+          <w:tcPr/>
+          <w:p>
+            <w:pPr>
+              <w:pStyle w:val="Compact"/>
+            </w:pPr>
+            <w:r>
+              <w:t xml:space="preserve">Mejora</w:t>
+            </w:r>
+          </w:p>
+        </w:tc>
+        <w:tc>
+          <w:tcPr/>
+          <w:p>
+            <w:pPr>
+              <w:pStyle w:val="Compact"/>
+            </w:pPr>
+            <w:r>
+              <w:t xml:space="preserve">Beneficio</w:t>
+            </w:r>
+          </w:p>
+        </w:tc>
+      </w:tr>
+      <w:tr>
+        <w:tc>
+          <w:tcPr/>
+          <w:p>
+            <w:pPr>
+              <w:pStyle w:val="Compact"/>
+            </w:pPr>
+            <w:r>
+              <w:t xml:space="preserve">17</w:t>
+            </w:r>
+          </w:p>
+        </w:tc>
+        <w:tc>
+          <w:tcPr/>
+          <w:p>
+            <w:pPr>
+              <w:pStyle w:val="Compact"/>
+            </w:pPr>
+            <w:r>
+              <w:t xml:space="preserve">Eliminación de endpoints, entidades y middleware de tracking no utilizados; simplificación de la arquitectura</w:t>
+            </w:r>
+          </w:p>
+        </w:tc>
+        <w:tc>
+          <w:tcPr/>
+          <w:p>
+            <w:pPr>
+              <w:pStyle w:val="Compact"/>
+            </w:pPr>
+            <w:r>
+              <w:t xml:space="preserve">Reducción de superficie de ataque y de overhead operacional</w:t>
             </w:r>
           </w:p>
         </w:tc>
@@ -1920,9 +2851,9 @@
         </w:pict>
       </w:r>
     </w:p>
-    <w:bookmarkEnd w:id="21"/>
-    <w:bookmarkEnd w:id="22"/>
-    <w:bookmarkStart w:id="23" w:name="X9a5a94ef461e542d882f10d04b268d3c209b027"/>
+    <w:bookmarkEnd w:id="24"/>
+    <w:bookmarkEnd w:id="25"/>
+    <w:bookmarkStart w:id="26" w:name="findings-de-nivel-informativo-bajo"/>
     <w:p>
       <w:pPr>
         <w:pStyle w:val="Heading3"/>
@@ -1958,14 +2889,15 @@
     <w:tbl>
       <w:tblPr>
         <w:tblStyle w:val="Table"/>
-        <w:tblW w:type="auto" w:w="0"/>
+        <w:tblW w:type="pct" w:w="5000"/>
+        <w:tblLayout w:type="fixed"/>
         <w:tblLook w:firstRow="1" w:lastRow="0" w:firstColumn="0" w:lastColumn="0" w:noHBand="0" w:noVBand="0" w:val="0020"/>
       </w:tblPr>
       <w:tblGrid>
-        <w:gridCol w:w="1980"/>
-        <w:gridCol w:w="1980"/>
-        <w:gridCol w:w="1980"/>
-        <w:gridCol w:w="1980"/>
+        <w:gridCol w:w="880"/>
+        <w:gridCol w:w="2420"/>
+        <w:gridCol w:w="2860"/>
+        <w:gridCol w:w="1760"/>
       </w:tblGrid>
       <w:tr>
         <w:trPr>
@@ -2046,18 +2978,18 @@
               <w:pStyle w:val="Compact"/>
             </w:pPr>
             <w:r>
-              <w:t xml:space="preserve">Recomendación de rotación periódica de credenciales de servicios externos (Microsoft, Google, Azure Blob Storage)</w:t>
-            </w:r>
-          </w:p>
-        </w:tc>
-        <w:tc>
-          <w:tcPr/>
-          <w:p>
-            <w:pPr>
-              <w:pStyle w:val="Compact"/>
-            </w:pPr>
-            <w:r>
-              <w:t xml:space="preserve">Pendiente (operación rutinaria)</w:t>
+              <w:t xml:space="preserve">Rotación de credenciales de servicios externos (Microsoft, Google, Azure SQL, Azure Blob Storage, servicios de IA)</w:t>
+            </w:r>
+          </w:p>
+        </w:tc>
+        <w:tc>
+          <w:tcPr/>
+          <w:p>
+            <w:pPr>
+              <w:pStyle w:val="Compact"/>
+            </w:pPr>
+            <w:r>
+              <w:t xml:space="preserve">✅ Completado durante el proceso de hardening; pendiente establecer ciclo recurrente</w:t>
             </w:r>
           </w:p>
         </w:tc>
@@ -2316,6 +3248,52 @@
           </w:p>
         </w:tc>
       </w:tr>
+      <w:tr>
+        <w:tc>
+          <w:tcPr/>
+          <w:p>
+            <w:pPr>
+              <w:pStyle w:val="Compact"/>
+            </w:pPr>
+            <w:r>
+              <w:t xml:space="preserve">INF-07</w:t>
+            </w:r>
+          </w:p>
+        </w:tc>
+        <w:tc>
+          <w:tcPr/>
+          <w:p>
+            <w:pPr>
+              <w:pStyle w:val="Compact"/>
+            </w:pPr>
+            <w:r>
+              <w:t xml:space="preserve">Bajo</w:t>
+            </w:r>
+          </w:p>
+        </w:tc>
+        <w:tc>
+          <w:tcPr/>
+          <w:p>
+            <w:pPr>
+              <w:pStyle w:val="Compact"/>
+            </w:pPr>
+            <w:r>
+              <w:t xml:space="preserve">Normalizar códigos HTTP de respuesta ante conflictos de unicidad y modificación concurrente (409 Conflict en lugar de 500 Internal Server Error)</w:t>
+            </w:r>
+          </w:p>
+        </w:tc>
+        <w:tc>
+          <w:tcPr/>
+          <w:p>
+            <w:pPr>
+              <w:pStyle w:val="Compact"/>
+            </w:pPr>
+            <w:r>
+              <w:t xml:space="preserve">Mejora de robustez operacional, no impacta seguridad</w:t>
+            </w:r>
+          </w:p>
+        </w:tc>
+      </w:tr>
     </w:tbl>
     <w:p>
       <w:pPr>
@@ -2332,9 +3310,9 @@
         </w:pict>
       </w:r>
     </w:p>
-    <w:bookmarkEnd w:id="23"/>
-    <w:bookmarkEnd w:id="24"/>
-    <w:bookmarkStart w:id="25" w:name="X684cc24b17dca0bea9b0163b4a245a17c2197d2"/>
+    <w:bookmarkEnd w:id="26"/>
+    <w:bookmarkEnd w:id="27"/>
+    <w:bookmarkStart w:id="28" w:name="Xc4e608ad98550b23834ae325adb85fffa203112"/>
     <w:p>
       <w:pPr>
         <w:pStyle w:val="Heading2"/>
@@ -2346,12 +3324,13 @@
     <w:tbl>
       <w:tblPr>
         <w:tblStyle w:val="Table"/>
-        <w:tblW w:type="auto" w:w="0"/>
+        <w:tblW w:type="pct" w:w="5000"/>
+        <w:tblLayout w:type="fixed"/>
         <w:tblLook w:firstRow="1" w:lastRow="0" w:firstColumn="0" w:lastColumn="0" w:noHBand="0" w:noVBand="0" w:val="0020"/>
       </w:tblPr>
       <w:tblGrid>
-        <w:gridCol w:w="3960"/>
-        <w:gridCol w:w="3960"/>
+        <w:gridCol w:w="3543"/>
+        <w:gridCol w:w="4376"/>
       </w:tblGrid>
       <w:tr>
         <w:trPr>
@@ -2399,7 +3378,17 @@
               <w:pStyle w:val="Compact"/>
             </w:pPr>
             <w:r>
-              <w:t xml:space="preserve">✅ Mitigado vía mecanismo automático de aislamiento entre proyectos</w:t>
+              <w:t xml:space="preserve">✅ Mitigado vía mecanismo automático de aislamiento entre proyectos;</w:t>
+            </w:r>
+            <w:r>
+              <w:t xml:space="preserve"> </w:t>
+            </w:r>
+            <w:r>
+              <w:rPr>
+                <w:b/>
+                <w:bCs/>
+              </w:rPr>
+              <w:t xml:space="preserve">validado runtime con pruebas dirigidas de acceso cruzado</w:t>
             </w:r>
           </w:p>
         </w:tc>
@@ -2423,7 +3412,7 @@
               <w:pStyle w:val="Compact"/>
             </w:pPr>
             <w:r>
-              <w:t xml:space="preserve">✅ Microsoft Entra ID + JWT con validación completa, lockout activado, rate limiting aplicado</w:t>
+              <w:t xml:space="preserve">✅ Microsoft Entra ID + JWT con validación completa, lockout activado, rate limiting aplicado, tokens de acceso y refresh diferenciados</w:t>
             </w:r>
           </w:p>
         </w:tc>
@@ -2447,7 +3436,17 @@
               <w:pStyle w:val="Compact"/>
             </w:pPr>
             <w:r>
-              <w:t xml:space="preserve">✅ Auditado, sin observaciones</w:t>
+              <w:t xml:space="preserve">✅ DTOs acotados + mapeo de objetos con campos sensibles explícitamente ignorados;</w:t>
+            </w:r>
+            <w:r>
+              <w:t xml:space="preserve"> </w:t>
+            </w:r>
+            <w:r>
+              <w:rPr>
+                <w:b/>
+                <w:bCs/>
+              </w:rPr>
+              <w:t xml:space="preserve">validado runtime con payload de asignación masiva</w:t>
             </w:r>
           </w:p>
         </w:tc>
@@ -2471,7 +3470,7 @@
               <w:pStyle w:val="Compact"/>
             </w:pPr>
             <w:r>
-              <w:t xml:space="preserve">✅ Rate limiting en endpoints sensibles, límites de tamaño en uploads</w:t>
+              <w:t xml:space="preserve">✅ Rate limiting en endpoints sensibles, límites de tamaño en uploads, cuotas por usuario en creación de recursos</w:t>
             </w:r>
           </w:p>
         </w:tc>
@@ -2519,7 +3518,7 @@
               <w:pStyle w:val="Compact"/>
             </w:pPr>
             <w:r>
-              <w:t xml:space="preserve">✅ Validación de estado en máquinas de estado críticas</w:t>
+              <w:t xml:space="preserve">✅ Validación de estado en máquinas de estado críticas; resistencia ante concurrencia verificada</w:t>
             </w:r>
           </w:p>
         </w:tc>
@@ -2567,7 +3566,7 @@
               <w:pStyle w:val="Compact"/>
             </w:pPr>
             <w:r>
-              <w:t xml:space="preserve">✅ Headers HTTP completos, configuración Kestrel endurecida, CORS restrictivo</w:t>
+              <w:t xml:space="preserve">✅ Headers HTTP completos validados con ZAP baseline scan, configuración Kestrel endurecida, CORS restrictivo, validación de inputs en headers</w:t>
             </w:r>
           </w:p>
         </w:tc>
@@ -2591,7 +3590,7 @@
               <w:pStyle w:val="Compact"/>
             </w:pPr>
             <w:r>
-              <w:t xml:space="preserve">✅ Endpoints demo eliminados, Swagger condicionado a entorno de desarrollo</w:t>
+              <w:t xml:space="preserve">✅ Endpoints y entidades no utilizadas eliminados, Swagger condicionado a entorno de desarrollo</w:t>
             </w:r>
           </w:p>
         </w:tc>
@@ -2615,7 +3614,7 @@
               <w:pStyle w:val="Compact"/>
             </w:pPr>
             <w:r>
-              <w:t xml:space="preserve">✅ Validación estricta de tokens externos (Microsoft Entra ID)</w:t>
+              <w:t xml:space="preserve">✅ Validación estricta de tokens externos (Microsoft Entra ID): firma, issuer, audience, expiración</w:t>
             </w:r>
           </w:p>
         </w:tc>
@@ -2628,8 +3627,8 @@
         </w:pict>
       </w:r>
     </w:p>
-    <w:bookmarkEnd w:id="25"/>
-    <w:bookmarkStart w:id="29" w:name="X0f409bd9c314fd5edd31aa475c8bfde10e6c9bf"/>
+    <w:bookmarkEnd w:id="28"/>
+    <w:bookmarkStart w:id="32" w:name="próximos-pasos-recomendados"/>
     <w:p>
       <w:pPr>
         <w:pStyle w:val="Heading2"/>
@@ -2638,7 +3637,7 @@
         <w:t xml:space="preserve">6. Próximos pasos recomendados</w:t>
       </w:r>
     </w:p>
-    <w:bookmarkStart w:id="26" w:name="X5d265bc763d584b5ddd5160be697b605a60853b"/>
+    <w:bookmarkStart w:id="29" w:name="X5d265bc763d584b5ddd5160be697b605a60853b"/>
     <w:p>
       <w:pPr>
         <w:pStyle w:val="Heading3"/>
@@ -2666,7 +3665,7 @@
         <w:t xml:space="preserve"> </w:t>
       </w:r>
       <w:r>
-        <w:t xml:space="preserve">con un equipo independiente de seguridad. La auditoría interna no reemplaza esta evaluación.</w:t>
+        <w:t xml:space="preserve">con un equipo independiente de seguridad. La auditoría interna no reemplaza esta evaluación. El equipo técnico de Siprecom puede coordinar y proveer el alcance, los entornos de prueba y la documentación necesaria cuando el cliente defina los requisitos y proveedor.</w:t>
       </w:r>
     </w:p>
     <w:p>
@@ -2774,8 +3773,8 @@
         <w:t xml:space="preserve">).</w:t>
       </w:r>
     </w:p>
-    <w:bookmarkEnd w:id="26"/>
-    <w:bookmarkStart w:id="27" w:name="a-mediano-plazo"/>
+    <w:bookmarkEnd w:id="29"/>
+    <w:bookmarkStart w:id="30" w:name="a-mediano-plazo"/>
     <w:p>
       <w:pPr>
         <w:pStyle w:val="Heading3"/>
@@ -2793,7 +3792,7 @@
         </w:numPr>
       </w:pPr>
       <w:r>
-        <w:t xml:space="preserve">Establecer rotación calendarizada de credenciales (90 días recomendado para client secrets de OAuth).</w:t>
+        <w:t xml:space="preserve">Establecer rotación calendarizada de credenciales (90 días recomendado para client secrets de OAuth) — el sistema ya cuenta con la primera rotación completada en este ciclo.</w:t>
       </w:r>
     </w:p>
     <w:p>
@@ -2817,11 +3816,11 @@
         </w:numPr>
       </w:pPr>
       <w:r>
-        <w:t xml:space="preserve">Implementar las observaciones INF-04, INF-05 e INF-06 según prioridad operativa.</w:t>
-      </w:r>
-    </w:p>
-    <w:bookmarkEnd w:id="27"/>
-    <w:bookmarkStart w:id="28" w:name="a-largo-plazo"/>
+        <w:t xml:space="preserve">Implementar las observaciones INF-04, INF-05, INF-06 e INF-07 según prioridad operativa.</w:t>
+      </w:r>
+    </w:p>
+    <w:bookmarkEnd w:id="30"/>
+    <w:bookmarkStart w:id="31" w:name="a-largo-plazo"/>
     <w:p>
       <w:pPr>
         <w:pStyle w:val="Heading3"/>
@@ -2861,9 +3860,9 @@
         </w:pict>
       </w:r>
     </w:p>
-    <w:bookmarkEnd w:id="28"/>
-    <w:bookmarkEnd w:id="29"/>
-    <w:bookmarkStart w:id="30" w:name="Xb427a6c5e4f2f2011d8bc025d7f1bf644bc335e"/>
+    <w:bookmarkEnd w:id="31"/>
+    <w:bookmarkEnd w:id="32"/>
+    <w:bookmarkStart w:id="33" w:name="conclusión"/>
     <w:p>
       <w:pPr>
         <w:pStyle w:val="Heading2"/>
@@ -2893,7 +3892,7 @@
         <w:t xml:space="preserve"> </w:t>
       </w:r>
       <w:r>
-        <w:t xml:space="preserve">para su puesta en producción. La auditoría interna permitió aplicar 14 mejoras de hardening alineadas con OWASP API Security Top 10, y validar que los componentes críticos del flujo de negocio (autenticación, autorización por proyecto, máquinas de estado) están implementados correctamente.</w:t>
+        <w:t xml:space="preserve">para su puesta en producción. La auditoría interna combinó análisis estático, fuzzing automatizado, escaneo pasivo de superficie HTTP y pruebas dirigidas, y permitió aplicar 17 mejoras de hardening alineadas con OWASP API Security Top 10. Los componentes críticos del flujo de negocio (autenticación, autorización por proyecto, máquinas de estado, integridad transaccional) fueron validados a nivel de código y mediante pruebas runtime, y se consideran implementados correctamente.</w:t>
       </w:r>
     </w:p>
     <w:p>
@@ -2901,7 +3900,7 @@
         <w:pStyle w:val="BodyText"/>
       </w:pPr>
       <w:r>
-        <w:t xml:space="preserve">Los findings restantes son de severidad</w:t>
+        <w:t xml:space="preserve">El escaneo pasivo final (OWASP ZAP baseline) no reportó hallazgos de severidad</w:t>
       </w:r>
       <w:r>
         <w:t xml:space="preserve"> </w:t>
@@ -2911,13 +3910,23 @@
           <w:b/>
           <w:bCs/>
         </w:rPr>
-        <w:t xml:space="preserve">informativa/baja</w:t>
+        <w:t xml:space="preserve">media o superior</w:t>
+      </w:r>
+      <w:r>
+        <w:t xml:space="preserve">. Los hallazgos restantes son de severidad</w:t>
       </w:r>
       <w:r>
         <w:t xml:space="preserve"> </w:t>
       </w:r>
       <w:r>
-        <w:t xml:space="preserve">y constituyen oportunidades de mejora continua, no condiciones bloqueantes.</w:t>
+        <w:rPr>
+          <w:b/>
+          <w:bCs/>
+        </w:rPr>
+        <w:t xml:space="preserve">informativa o baja</w:t>
+      </w:r>
+      <w:r>
+        <w:t xml:space="preserve">, y constituyen oportunidades de mejora continua, no condiciones bloqueantes.</w:t>
       </w:r>
     </w:p>
     <w:p>
@@ -2941,7 +3950,7 @@
         <w:t xml:space="preserve"> </w:t>
       </w:r>
       <w:r>
-        <w:t xml:space="preserve">como siguiente paso antes del pase definitivo a producción, y mantener una práctica regular de auditorías de seguridad y rotación de credenciales.</w:t>
+        <w:t xml:space="preserve">como siguiente paso antes del pase definitivo a producción, en el momento y bajo los términos que el cliente defina según sus requisitos de cumplimiento y políticas internas. El equipo técnico de Siprecom queda disponible para coordinar el alcance, los accesos y la documentación necesaria.</w:t>
       </w:r>
     </w:p>
     <w:p>
@@ -2960,11 +3969,11 @@
           <w:i/>
           <w:iCs/>
         </w:rPr>
-        <w:t xml:space="preserve">Documento preparado por el equipo técnico de Siprecom como evidencia del proceso de hardening previo al pentest externo. Para consultas técnicas sobre cualquier mejora aplicada, contactar al equipo de desarrollo.</w:t>
-      </w:r>
-    </w:p>
-    <w:bookmarkEnd w:id="30"/>
-    <w:bookmarkEnd w:id="31"/>
+        <w:t xml:space="preserve">Documento preparado por el equipo técnico de Siprecom como evidencia del proceso de hardening previo al pentest externo. Para consultas técnicas sobre cualquier mejora aplicada o para iniciar la coordinación del pentest externo, contactar al equipo de desarrollo.</w:t>
+      </w:r>
+    </w:p>
+    <w:bookmarkEnd w:id="33"/>
+    <w:bookmarkEnd w:id="34"/>
     <w:sectPr>
       <w:footnotePr>
         <w:numRestart w:val="eachSect"/>

</xml_diff>